<commit_message>
research-program: add the information request to the work bundle
<!-- workflow-source:local_request -->
</commit_message>
<xml_diff>
--- a/research-program/artifacts/work-bundle/docx/00-COVER-MEMO.docx
+++ b/research-program/artifacts/work-bundle/docx/00-COVER-MEMO.docx
@@ -239,6 +239,47 @@
           <w:sz w:val="22"/>
         </w:rPr>
         <w:t xml:space="preserve"> when you make a claim about a tool, so the reader can check it.</w:t>
+      </w:r>
+    </w:p>
+    <w:p>
+      <w:pPr>
+        <w:pStyle w:val="ListNumber"/>
+      </w:pPr>
+      <w:r>
+        <w:rPr>
+          <w:rFonts w:ascii="Arial" w:hAnsi="Arial"/>
+          <w:b/>
+          <w:i w:val="0"/>
+          <w:sz w:val="22"/>
+        </w:rPr>
+        <w:t>There is a task for you in this bundle.</w:t>
+      </w:r>
+      <w:r>
+        <w:rPr>
+          <w:rFonts w:ascii="Arial" w:hAnsi="Arial"/>
+          <w:b w:val="0"/>
+          <w:i w:val="0"/>
+          <w:sz w:val="22"/>
+        </w:rPr>
+        <w:t xml:space="preserve"> </w:t>
+      </w:r>
+      <w:r>
+        <w:rPr>
+          <w:rFonts w:ascii="Consolas" w:hAnsi="Consolas"/>
+          <w:b w:val="0"/>
+          <w:i w:val="0"/>
+          <w:sz w:val="20"/>
+        </w:rPr>
+        <w:t>01-INFORMATION-REQUEST.md</w:t>
+      </w:r>
+      <w:r>
+        <w:rPr>
+          <w:rFonts w:ascii="Arial" w:hAnsi="Arial"/>
+          <w:b w:val="0"/>
+          <w:i w:val="0"/>
+          <w:sz w:val="22"/>
+        </w:rPr>
+        <w:t xml:space="preserve"> asks for the environment and document-shape information I need in order to build the next round of tools. Please answer it as a single returned document, observing its do-not-include list exactly: no names, no document content, no personal data, no internal system identifiers, no credentials. Counts as ranges, formats, yes or no, and field names without values are what is wanted, and "unknown" is an acceptable answer.</w:t>
       </w:r>
     </w:p>
     <w:p>

</xml_diff>